<commit_message>
Refresh clean SDK 2 release evidence
</commit_message>
<xml_diff>
--- a/docs/reports/MCP_Privilege_Profiler_Project_Report.docx
+++ b/docs/reports/MCP_Privilege_Profiler_Project_Report.docx
@@ -7163,7 +7163,16 @@
                 <w:color w:val="111111"/>
                 <w:sz w:val="18"/>
               </w:rPr>
-              <w:t>75/75 on SDK v2 working tree; clean-candidate rerun required</w:t>
+              <w:t xml:space="preserve">75/75 from clean SDK v2 commit </w:t>
+            </w:r>
+            <w:r>
+              <w:rPr>
+                <w:rFonts w:ascii="Consolas" w:hAnsi="Consolas"/>
+                <w:color w:val="1F2933"/>
+                <w:sz w:val="18"/>
+                <w:shd w:fill="EDF1F4"/>
+              </w:rPr>
+              <w:t>51cfe43</w:t>
             </w:r>
           </w:p>
         </w:tc>
@@ -7261,7 +7270,7 @@
           <w:color w:val="111111"/>
           <w:sz w:val="22"/>
         </w:rPr>
-        <w:t>After the SDK v2 migration and catalog-response race correction, the current Python suite recorded 161 passing tests and one expected Windows symlink-related skip. One release-evidence test remains intentionally red until the benchmark is regenerated from a clean candidate. Ruff passes and Pyright reports zero errors and warnings.</w:t>
+        <w:t>After the SDK v2 migration, catalog-response race correction, and timeout-budget separation, the current Python suite records 163 passing tests and one expected Windows symlink-related skip. Ruff passes and Pyright reports zero errors and warnings.</w:t>
       </w:r>
     </w:p>
     <w:p>
@@ -8160,7 +8169,7 @@
                 <w:color w:val="111111"/>
                 <w:sz w:val="18"/>
               </w:rPr>
-              <w:t>0.0036</w:t>
+              <w:t>0.0037</w:t>
             </w:r>
           </w:p>
         </w:tc>
@@ -8187,7 +8196,7 @@
                 <w:color w:val="111111"/>
                 <w:sz w:val="18"/>
               </w:rPr>
-              <w:t>0.4048</w:t>
+              <w:t>0.4499</w:t>
             </w:r>
           </w:p>
         </w:tc>
@@ -8214,7 +8223,7 @@
                 <w:color w:val="111111"/>
                 <w:sz w:val="18"/>
               </w:rPr>
-              <w:t>0.4871</w:t>
+              <w:t>0.5196</w:t>
             </w:r>
           </w:p>
         </w:tc>
@@ -8296,7 +8305,7 @@
                 <w:color w:val="111111"/>
                 <w:sz w:val="18"/>
               </w:rPr>
-              <w:t>3.6911</w:t>
+              <w:t>3.1182</w:t>
             </w:r>
           </w:p>
         </w:tc>
@@ -8323,7 +8332,7 @@
                 <w:color w:val="111111"/>
                 <w:sz w:val="18"/>
               </w:rPr>
-              <w:t>7.2526</w:t>
+              <w:t>4.9001</w:t>
             </w:r>
           </w:p>
         </w:tc>
@@ -8350,7 +8359,7 @@
                 <w:color w:val="111111"/>
                 <w:sz w:val="18"/>
               </w:rPr>
-              <w:t>29.1259</w:t>
+              <w:t>9.7694</w:t>
             </w:r>
           </w:p>
         </w:tc>
@@ -8432,7 +8441,7 @@
                 <w:color w:val="111111"/>
                 <w:sz w:val="18"/>
               </w:rPr>
-              <w:t>26.1979</w:t>
+              <w:t>26.4407</w:t>
             </w:r>
           </w:p>
         </w:tc>
@@ -8459,7 +8468,7 @@
                 <w:color w:val="111111"/>
                 <w:sz w:val="18"/>
               </w:rPr>
-              <w:t>30.6331</w:t>
+              <w:t>33.5494</w:t>
             </w:r>
           </w:p>
         </w:tc>
@@ -8486,7 +8495,7 @@
                 <w:color w:val="111111"/>
                 <w:sz w:val="18"/>
               </w:rPr>
-              <w:t>33.9782</w:t>
+              <w:t>38.0857</w:t>
             </w:r>
           </w:p>
         </w:tc>
@@ -8568,7 +8577,7 @@
                 <w:color w:val="111111"/>
                 <w:sz w:val="18"/>
               </w:rPr>
-              <w:t>23.1002</w:t>
+              <w:t>22.9489</w:t>
             </w:r>
           </w:p>
         </w:tc>
@@ -8595,7 +8604,7 @@
                 <w:color w:val="111111"/>
                 <w:sz w:val="18"/>
               </w:rPr>
-              <w:t>26.7256</w:t>
+              <w:t>29.5335</w:t>
             </w:r>
           </w:p>
         </w:tc>
@@ -8622,7 +8631,7 @@
                 <w:color w:val="111111"/>
                 <w:sz w:val="18"/>
               </w:rPr>
-              <w:t>27.4122</w:t>
+              <w:t>29.9775</w:t>
             </w:r>
           </w:p>
         </w:tc>
@@ -8704,7 +8713,7 @@
                 <w:color w:val="111111"/>
                 <w:sz w:val="18"/>
               </w:rPr>
-              <w:t>1.1434</w:t>
+              <w:t>1.2500</w:t>
             </w:r>
           </w:p>
         </w:tc>
@@ -8731,7 +8740,7 @@
                 <w:color w:val="111111"/>
                 <w:sz w:val="18"/>
               </w:rPr>
-              <w:t>1.7432</w:t>
+              <w:t>1.5489</w:t>
             </w:r>
           </w:p>
         </w:tc>
@@ -8758,7 +8767,7 @@
                 <w:color w:val="111111"/>
                 <w:sz w:val="18"/>
               </w:rPr>
-              <w:t>2.5149</w:t>
+              <w:t>1.8467</w:t>
             </w:r>
           </w:p>
         </w:tc>
@@ -8776,7 +8785,7 @@
           <w:color w:val="111111"/>
           <w:sz w:val="22"/>
         </w:rPr>
-        <w:t>Startup plus complete live inventory measured 1,792.6222 ms on the SDK v2 Windows working-tree run. The increased proxy delta includes the new fresh catalog revalidation before each call. Performance is machine- and workload-specific, and the benchmark must run again from the clean candidate.</w:t>
+        <w:t>Startup plus complete live inventory measured 1,803.7120 ms on the clean SDK v2 Windows run. The proxy delta includes fresh catalog revalidation before each call. Performance is machine- and workload-specific.</w:t>
       </w:r>
     </w:p>
     <w:p>
@@ -11355,7 +11364,24 @@
           <w:color w:val="111111"/>
           <w:sz w:val="22"/>
         </w:rPr>
-        <w:t>The build, clean-tree, real-Claude, and live-Wazuh items in this list were completed before the SDK v2 migration. They remain useful historical evidence but must be regenerated from the exact release-candidate commit. The SDK v2 working-tree benchmark passed 75/75 cases and must be repeated once from that clean commit.</w:t>
+        <w:t xml:space="preserve">The build, clean-tree, real-Claude, and live-Wazuh items in this list were completed before the SDK v2 migration. They remain useful historical evidence but must be regenerated from the exact release-candidate commit. The SDK v2 benchmark passed 75/75 cases from clean commit </w:t>
+      </w:r>
+      <w:r>
+        <w:rPr>
+          <w:rFonts w:ascii="Consolas" w:hAnsi="Consolas"/>
+          <w:color w:val="1F2933"/>
+          <w:sz w:val="21"/>
+          <w:shd w:fill="EDF1F4"/>
+        </w:rPr>
+        <w:t>51cfe43</w:t>
+      </w:r>
+      <w:r>
+        <w:rPr>
+          <w:rFonts w:ascii="Calibri" w:hAnsi="Calibri"/>
+          <w:color w:val="111111"/>
+          <w:sz w:val="22"/>
+        </w:rPr>
+        <w:t>.</w:t>
       </w:r>
     </w:p>
     <w:p>
@@ -11473,7 +11499,7 @@
           <w:color w:val="111111"/>
           <w:sz w:val="22"/>
         </w:rPr>
-        <w:t>no post-SDK-v2 release benchmark, build inspection, or clean-clone proof;</w:t>
+        <w:t>no post-SDK-v2 distribution inspection or clean-clone proof;</w:t>
       </w:r>
     </w:p>
     <w:p>

</xml_diff>

<commit_message>
Record post-migration release checks
</commit_message>
<xml_diff>
--- a/docs/reports/MCP_Privilege_Profiler_Project_Report.docx
+++ b/docs/reports/MCP_Privilege_Profiler_Project_Report.docx
@@ -368,7 +368,7 @@
                 <w:color w:val="111111"/>
                 <w:sz w:val="19"/>
               </w:rPr>
-              <w:t>161 passing tests; 75-case SDK 2 benchmark</w:t>
+              <w:t>163 passing tests; clean 75-case SDK 2 benchmark</w:t>
             </w:r>
           </w:p>
         </w:tc>
@@ -484,7 +484,7 @@
                 <w:color w:val="111111"/>
                 <w:sz w:val="19"/>
               </w:rPr>
-              <w:t>Clean-candidate, Claude, Wazuh, hosted CI, and external review</w:t>
+              <w:t>Claude, Wazuh, hosted CI, independent review, and publication</w:t>
             </w:r>
           </w:p>
         </w:tc>
@@ -934,7 +934,7 @@
           <w:color w:val="111111"/>
           <w:sz w:val="22"/>
         </w:rPr>
-        <w:t>The code and automated suite have since migrated to MCP Python SDK 2.0.0, and the SDK v2 working-tree benchmark has passed. The remaining release work includes a clean-candidate benchmark, real-Claude run, live Wazuh proof, build and clean-clone evidence on the exact candidate, followed by hosted CI, external review, final package-name clearance, and public release.</w:t>
+        <w:t>The code and automated suite have since migrated to MCP Python SDK 2.0.0. The clean SDK v2 benchmark, local distribution inspection, and local clean-tree demo pass. The remaining release work includes refreshed real-Claude and live Wazuh proof on the exact candidate, followed by hosted CI, independent review, final package-name clearance, and public release.</w:t>
       </w:r>
     </w:p>
     <w:p>
@@ -11321,17 +11321,17 @@
           <w:color w:val="111111"/>
           <w:sz w:val="22"/>
         </w:rPr>
-        <w:t>local wheel and source-distribution smoke tests plus archive inspection for</w:t>
-      </w:r>
-    </w:p>
-    <w:p>
-      <w:r>
-        <w:rPr>
-          <w:rFonts w:ascii="Calibri" w:hAnsi="Calibri"/>
-          <w:color w:val="111111"/>
-          <w:sz w:val="22"/>
-        </w:rPr>
-        <w:t>ignored caches, runtime state, databases, personal documents, and private-key file types; and</w:t>
+        <w:t>post-migration wheel and source-distribution smoke tests plus archive</w:t>
+      </w:r>
+    </w:p>
+    <w:p>
+      <w:r>
+        <w:rPr>
+          <w:rFonts w:ascii="Calibri" w:hAnsi="Calibri"/>
+          <w:color w:val="111111"/>
+          <w:sz w:val="22"/>
+        </w:rPr>
+        <w:t>inspection of 56 wheel entries and 198 source-archive entries, with no ignored cache, runtime-state, database, secret-key, or personal-path matches; and</w:t>
       </w:r>
     </w:p>
     <w:p>
@@ -11344,7 +11344,7 @@
           <w:color w:val="111111"/>
           <w:sz w:val="22"/>
         </w:rPr>
-        <w:t>a fresh local clean-tree simulation of all 194 publishable files, including</w:t>
+        <w:t>a fresh SDK v2 clean-tree simulation of all 197 tracked files, including a</w:t>
       </w:r>
     </w:p>
     <w:p>
@@ -11364,7 +11364,7 @@
           <w:color w:val="111111"/>
           <w:sz w:val="22"/>
         </w:rPr>
-        <w:t xml:space="preserve">The build, clean-tree, real-Claude, and live-Wazuh items in this list were completed before the SDK v2 migration. They remain useful historical evidence but must be regenerated from the exact release-candidate commit. The SDK v2 benchmark passed 75/75 cases from clean commit </w:t>
+        <w:t xml:space="preserve">The real-Claude and live-Wazuh items in this list were completed before the SDK v2 migration. They remain useful historical evidence but must be regenerated from the exact release-candidate commit. The SDK v2 benchmark passed 75/75 cases from clean commit </w:t>
       </w:r>
       <w:r>
         <w:rPr>
@@ -11381,7 +11381,7 @@
           <w:color w:val="111111"/>
           <w:sz w:val="22"/>
         </w:rPr>
-        <w:t>.</w:t>
+        <w:t>; the post-migration build and clean-tree proofs also pass.</w:t>
       </w:r>
     </w:p>
     <w:p>
@@ -11487,19 +11487,6 @@
           <w:sz w:val="22"/>
         </w:rPr>
         <w:t>no post-SDK-v2 real-Claude or live-Wazuh acceptance run;</w:t>
-      </w:r>
-    </w:p>
-    <w:p>
-      <w:pPr>
-        <w:pStyle w:val="ListBullet"/>
-      </w:pPr>
-      <w:r>
-        <w:rPr>
-          <w:rFonts w:ascii="Calibri" w:hAnsi="Calibri"/>
-          <w:color w:val="111111"/>
-          <w:sz w:val="22"/>
-        </w:rPr>
-        <w:t>no post-SDK-v2 distribution inspection or clean-clone proof;</w:t>
       </w:r>
     </w:p>
     <w:p>
@@ -14676,7 +14663,7 @@
                 <w:color w:val="111111"/>
                 <w:sz w:val="18"/>
               </w:rPr>
-              <w:t>SDK v2 working-tree run passed</w:t>
+              <w:t>Clean SDK v2 run passed</w:t>
             </w:r>
           </w:p>
         </w:tc>
@@ -14702,7 +14689,16 @@
                 <w:color w:val="111111"/>
                 <w:sz w:val="18"/>
               </w:rPr>
-              <w:t>75/75 cases; clean-candidate rerun remains</w:t>
+              <w:t xml:space="preserve">75/75 cases at commit </w:t>
+            </w:r>
+            <w:r>
+              <w:rPr>
+                <w:rFonts w:ascii="Consolas" w:hAnsi="Consolas"/>
+                <w:color w:val="1F2933"/>
+                <w:sz w:val="18"/>
+                <w:shd w:fill="EDF1F4"/>
+              </w:rPr>
+              <w:t>51cfe43</w:t>
             </w:r>
           </w:p>
         </w:tc>
@@ -14783,7 +14779,7 @@
                 <w:color w:val="111111"/>
                 <w:sz w:val="18"/>
               </w:rPr>
-              <w:t>SDK v2 release evidence, hosted CI, clean clone, reviews, and release remain</w:t>
+              <w:t>Local build and clean-tree proof pass; hosted CI, independent clone, reviews, and release remain</w:t>
             </w:r>
           </w:p>
         </w:tc>
@@ -14824,7 +14820,7 @@
           <w:color w:val="1F2933"/>
           <w:sz w:val="22"/>
         </w:rPr>
-        <w:t>MCP Privilege Profiler is a pre-alpha, task-scoped security proxy for one local stdio MCP server. It converts labeled run evidence into a human-reviewed, deny-by-default policy; hides denied tools; enforces exact constraints, limits, approvals, audit, and drift checks; and emits privacy-minimized events with a tested Wazuh detection bridge. The SDK v2 deterministic lab and automated suite pass; earlier Wazuh, benchmark, and controlled real-agent evidence must be repeated for the release candidate. A source-checkout safe demo exercises the enforced boundary, while hosted CI, clean-clone review, external review, and public release remain.</w:t>
+        <w:t>MCP Privilege Profiler is a pre-alpha, task-scoped security proxy for one local stdio MCP server. It converts labeled run evidence into a human-reviewed, deny-by-default policy; hides denied tools; enforces exact constraints, limits, approvals, audit, and drift checks; and emits privacy-minimized events with a tested Wazuh detection bridge. The SDK v2 deterministic lab and automated suite pass; earlier Wazuh and controlled real-agent evidence must be repeated for the release candidate. A source-checkout safe demo exercises the enforced boundary, while hosted CI, independent clean-clone review, external review, and public release remain.</w:t>
       </w:r>
     </w:p>
     <w:sectPr>

</xml_diff>

<commit_message>
Finalize professional engineering report
</commit_message>
<xml_diff>
--- a/docs/reports/MCP_Privilege_Profiler_Project_Report.docx
+++ b/docs/reports/MCP_Privilege_Profiler_Project_Report.docx
@@ -357,18 +357,8 @@
             <w:shd w:fill="FFFFFF"/>
           </w:tcPr>
           <w:p>
-            <w:pPr>
-              <w:spacing w:after="0"/>
-            </w:pPr>
-            <w:r/>
             <w:r>
-              <w:rPr>
-                <w:rFonts w:ascii="Calibri" w:hAnsi="Calibri"/>
-                <w:b w:val="0"/>
-                <w:color w:val="111111"/>
-                <w:sz w:val="19"/>
-              </w:rPr>
-              <w:t>163 passing tests; clean 75-case SDK 2 benchmark</w:t>
+              <w:t>164 passing tests plus one expected Windows skip; post-SDK2 real-Claude enforcement, hosted CI, and clean 75-case benchmark passed</w:t>
             </w:r>
           </w:p>
         </w:tc>
@@ -473,18 +463,8 @@
             <w:shd w:fill="FFFFFF"/>
           </w:tcPr>
           <w:p>
-            <w:pPr>
-              <w:spacing w:after="0"/>
-            </w:pPr>
-            <w:r/>
             <w:r>
-              <w:rPr>
-                <w:rFonts w:ascii="Calibri" w:hAnsi="Calibri"/>
-                <w:b w:val="0"/>
-                <w:color w:val="111111"/>
-                <w:sz w:val="19"/>
-              </w:rPr>
-              <w:t>Claude, Wazuh, hosted CI, independent review, and publication</w:t>
+              <w:t>Wazuh rerun, independent review, name clearance, and public release</w:t>
             </w:r>
           </w:p>
         </w:tc>
@@ -929,12 +909,7 @@
     </w:p>
     <w:p>
       <w:r>
-        <w:rPr>
-          <w:rFonts w:ascii="Calibri" w:hAnsi="Calibri"/>
-          <w:color w:val="111111"/>
-          <w:sz w:val="22"/>
-        </w:rPr>
-        <w:t>The code and automated suite have since migrated to MCP Python SDK 2.0.0. The clean SDK v2 benchmark, local distribution inspection, and local clean-tree demo pass. The remaining release work includes refreshed real-Claude and live Wazuh proof on the exact candidate, followed by hosted CI, independent review, final package-name clearance, and public release.</w:t>
+        <w:t>Since the MCP Python SDK 2.0.0 migration, the complete automated suite, distribution checks, controlled Claude profiling and policy-enforced Claude run, hosted GitHub Actions matrix, and current clean 75-case benchmark have passed. The earlier Wazuh engine and live-ingestion proof remains valid historical evidence, but it has not yet been rerun on the exact current release-candidate commit. Independent review, final package-name clearance, and public release also remain.</w:t>
       </w:r>
     </w:p>
     <w:p>
@@ -5068,18 +5043,8 @@
             <w:vAlign w:val="center"/>
           </w:tcPr>
           <w:p>
-            <w:pPr>
-              <w:spacing w:before="0" w:after="0"/>
-              <w:jc w:val="center"/>
-            </w:pPr>
-            <w:r/>
             <w:r>
-              <w:rPr>
-                <w:rFonts w:ascii="Calibri" w:hAnsi="Calibri"/>
-                <w:color w:val="111111"/>
-                <w:sz w:val="18"/>
-              </w:rPr>
-              <w:t>Require approval</w:t>
+              <w:t>Deny for this read-only task; require approval only in a separately reviewed write task</w:t>
             </w:r>
           </w:p>
         </w:tc>
@@ -7153,26 +7118,8 @@
             <w:vAlign w:val="center"/>
           </w:tcPr>
           <w:p>
-            <w:pPr>
-              <w:spacing w:before="0" w:after="0"/>
-            </w:pPr>
-            <w:r/>
             <w:r>
-              <w:rPr>
-                <w:rFonts w:ascii="Calibri" w:hAnsi="Calibri"/>
-                <w:color w:val="111111"/>
-                <w:sz w:val="18"/>
-              </w:rPr>
-              <w:t xml:space="preserve">75/75 from clean SDK v2 commit </w:t>
-            </w:r>
-            <w:r>
-              <w:rPr>
-                <w:rFonts w:ascii="Consolas" w:hAnsi="Consolas"/>
-                <w:color w:val="1F2933"/>
-                <w:sz w:val="18"/>
-                <w:shd w:fill="EDF1F4"/>
-              </w:rPr>
-              <w:t>51cfe43</w:t>
+              <w:t>75/75 at clean post-lifecycle-correction commit 3f7ba2a</w:t>
             </w:r>
           </w:p>
         </w:tc>
@@ -7242,17 +7189,8 @@
             <w:vAlign w:val="center"/>
           </w:tcPr>
           <w:p>
-            <w:pPr>
-              <w:spacing w:before="0" w:after="0"/>
-            </w:pPr>
-            <w:r/>
             <w:r>
-              <w:rPr>
-                <w:rFonts w:ascii="Calibri" w:hAnsi="Calibri"/>
-                <w:color w:val="111111"/>
-                <w:sz w:val="18"/>
-              </w:rPr>
-              <w:t>Passed before SDK v2; rerun required</w:t>
+              <w:t>Passed after SDK2 at beaa6e9; two profile runs plus one enforced run</w:t>
             </w:r>
           </w:p>
         </w:tc>
@@ -7265,12 +7203,7 @@
     </w:p>
     <w:p>
       <w:r>
-        <w:rPr>
-          <w:rFonts w:ascii="Calibri" w:hAnsi="Calibri"/>
-          <w:color w:val="111111"/>
-          <w:sz w:val="22"/>
-        </w:rPr>
-        <w:t>After the SDK v2 migration, catalog-response race correction, and timeout-budget separation, the current Python suite records 163 passing tests and one expected Windows symlink-related skip. Ruff passes and Pyright reports zero errors and warnings.</w:t>
+        <w:t>After the SDK v2 migration and subsequent lifecycle corrections, the current Python suite records 164 passing tests and one expected Windows symlink-related skip. Ruff passes and Pyright reports zero errors and warnings.</w:t>
       </w:r>
     </w:p>
     <w:p>
@@ -8158,18 +8091,8 @@
             <w:vAlign w:val="center"/>
           </w:tcPr>
           <w:p>
-            <w:pPr>
-              <w:spacing w:before="0" w:after="0"/>
-              <w:jc w:val="center"/>
-            </w:pPr>
-            <w:r/>
             <w:r>
-              <w:rPr>
-                <w:rFonts w:ascii="Calibri" w:hAnsi="Calibri"/>
-                <w:color w:val="111111"/>
-                <w:sz w:val="18"/>
-              </w:rPr>
-              <w:t>0.0037</w:t>
+              <w:t>0.0023</w:t>
             </w:r>
           </w:p>
         </w:tc>
@@ -8185,18 +8108,8 @@
             <w:vAlign w:val="center"/>
           </w:tcPr>
           <w:p>
-            <w:pPr>
-              <w:spacing w:before="0" w:after="0"/>
-              <w:jc w:val="center"/>
-            </w:pPr>
-            <w:r/>
             <w:r>
-              <w:rPr>
-                <w:rFonts w:ascii="Calibri" w:hAnsi="Calibri"/>
-                <w:color w:val="111111"/>
-                <w:sz w:val="18"/>
-              </w:rPr>
-              <w:t>0.4499</w:t>
+              <w:t>0.2794</w:t>
             </w:r>
           </w:p>
         </w:tc>
@@ -8212,18 +8125,8 @@
             <w:vAlign w:val="center"/>
           </w:tcPr>
           <w:p>
-            <w:pPr>
-              <w:spacing w:before="0" w:after="0"/>
-              <w:jc w:val="center"/>
-            </w:pPr>
-            <w:r/>
             <w:r>
-              <w:rPr>
-                <w:rFonts w:ascii="Calibri" w:hAnsi="Calibri"/>
-                <w:color w:val="111111"/>
-                <w:sz w:val="18"/>
-              </w:rPr>
-              <w:t>0.5196</w:t>
+              <w:t>0.3498</w:t>
             </w:r>
           </w:p>
         </w:tc>
@@ -8294,18 +8197,8 @@
             <w:vAlign w:val="center"/>
           </w:tcPr>
           <w:p>
-            <w:pPr>
-              <w:spacing w:before="0" w:after="0"/>
-              <w:jc w:val="center"/>
-            </w:pPr>
-            <w:r/>
             <w:r>
-              <w:rPr>
-                <w:rFonts w:ascii="Calibri" w:hAnsi="Calibri"/>
-                <w:color w:val="111111"/>
-                <w:sz w:val="18"/>
-              </w:rPr>
-              <w:t>3.1182</w:t>
+              <w:t>3.8008</w:t>
             </w:r>
           </w:p>
         </w:tc>
@@ -8321,18 +8214,8 @@
             <w:vAlign w:val="center"/>
           </w:tcPr>
           <w:p>
-            <w:pPr>
-              <w:spacing w:before="0" w:after="0"/>
-              <w:jc w:val="center"/>
-            </w:pPr>
-            <w:r/>
             <w:r>
-              <w:rPr>
-                <w:rFonts w:ascii="Calibri" w:hAnsi="Calibri"/>
-                <w:color w:val="111111"/>
-                <w:sz w:val="18"/>
-              </w:rPr>
-              <w:t>4.9001</w:t>
+              <w:t>4.8037</w:t>
             </w:r>
           </w:p>
         </w:tc>
@@ -8348,18 +8231,8 @@
             <w:vAlign w:val="center"/>
           </w:tcPr>
           <w:p>
-            <w:pPr>
-              <w:spacing w:before="0" w:after="0"/>
-              <w:jc w:val="center"/>
-            </w:pPr>
-            <w:r/>
             <w:r>
-              <w:rPr>
-                <w:rFonts w:ascii="Calibri" w:hAnsi="Calibri"/>
-                <w:color w:val="111111"/>
-                <w:sz w:val="18"/>
-              </w:rPr>
-              <w:t>9.7694</w:t>
+              <w:t>9.7789</w:t>
             </w:r>
           </w:p>
         </w:tc>
@@ -8430,18 +8303,8 @@
             <w:vAlign w:val="center"/>
           </w:tcPr>
           <w:p>
-            <w:pPr>
-              <w:spacing w:before="0" w:after="0"/>
-              <w:jc w:val="center"/>
-            </w:pPr>
-            <w:r/>
             <w:r>
-              <w:rPr>
-                <w:rFonts w:ascii="Calibri" w:hAnsi="Calibri"/>
-                <w:color w:val="111111"/>
-                <w:sz w:val="18"/>
-              </w:rPr>
-              <w:t>26.4407</w:t>
+              <w:t>20.8414</w:t>
             </w:r>
           </w:p>
         </w:tc>
@@ -8457,18 +8320,8 @@
             <w:vAlign w:val="center"/>
           </w:tcPr>
           <w:p>
-            <w:pPr>
-              <w:spacing w:before="0" w:after="0"/>
-              <w:jc w:val="center"/>
-            </w:pPr>
-            <w:r/>
             <w:r>
-              <w:rPr>
-                <w:rFonts w:ascii="Calibri" w:hAnsi="Calibri"/>
-                <w:color w:val="111111"/>
-                <w:sz w:val="18"/>
-              </w:rPr>
-              <w:t>33.5494</w:t>
+              <w:t>24.3417</w:t>
             </w:r>
           </w:p>
         </w:tc>
@@ -8484,18 +8337,8 @@
             <w:vAlign w:val="center"/>
           </w:tcPr>
           <w:p>
-            <w:pPr>
-              <w:spacing w:before="0" w:after="0"/>
-              <w:jc w:val="center"/>
-            </w:pPr>
-            <w:r/>
             <w:r>
-              <w:rPr>
-                <w:rFonts w:ascii="Calibri" w:hAnsi="Calibri"/>
-                <w:color w:val="111111"/>
-                <w:sz w:val="18"/>
-              </w:rPr>
-              <w:t>38.0857</w:t>
+              <w:t>27.7502</w:t>
             </w:r>
           </w:p>
         </w:tc>
@@ -8566,18 +8409,8 @@
             <w:vAlign w:val="center"/>
           </w:tcPr>
           <w:p>
-            <w:pPr>
-              <w:spacing w:before="0" w:after="0"/>
-              <w:jc w:val="center"/>
-            </w:pPr>
-            <w:r/>
             <w:r>
-              <w:rPr>
-                <w:rFonts w:ascii="Calibri" w:hAnsi="Calibri"/>
-                <w:color w:val="111111"/>
-                <w:sz w:val="18"/>
-              </w:rPr>
-              <w:t>22.9489</w:t>
+              <w:t>17.5613</w:t>
             </w:r>
           </w:p>
         </w:tc>
@@ -8593,18 +8426,8 @@
             <w:vAlign w:val="center"/>
           </w:tcPr>
           <w:p>
-            <w:pPr>
-              <w:spacing w:before="0" w:after="0"/>
-              <w:jc w:val="center"/>
-            </w:pPr>
-            <w:r/>
             <w:r>
-              <w:rPr>
-                <w:rFonts w:ascii="Calibri" w:hAnsi="Calibri"/>
-                <w:color w:val="111111"/>
-                <w:sz w:val="18"/>
-              </w:rPr>
-              <w:t>29.5335</w:t>
+              <w:t>20.3704</w:t>
             </w:r>
           </w:p>
         </w:tc>
@@ -8620,18 +8443,8 @@
             <w:vAlign w:val="center"/>
           </w:tcPr>
           <w:p>
-            <w:pPr>
-              <w:spacing w:before="0" w:after="0"/>
-              <w:jc w:val="center"/>
-            </w:pPr>
-            <w:r/>
             <w:r>
-              <w:rPr>
-                <w:rFonts w:ascii="Calibri" w:hAnsi="Calibri"/>
-                <w:color w:val="111111"/>
-                <w:sz w:val="18"/>
-              </w:rPr>
-              <w:t>29.9775</w:t>
+              <w:t>20.6581</w:t>
             </w:r>
           </w:p>
         </w:tc>
@@ -8702,18 +8515,8 @@
             <w:vAlign w:val="center"/>
           </w:tcPr>
           <w:p>
-            <w:pPr>
-              <w:spacing w:before="0" w:after="0"/>
-              <w:jc w:val="center"/>
-            </w:pPr>
-            <w:r/>
             <w:r>
-              <w:rPr>
-                <w:rFonts w:ascii="Calibri" w:hAnsi="Calibri"/>
-                <w:color w:val="111111"/>
-                <w:sz w:val="18"/>
-              </w:rPr>
-              <w:t>1.2500</w:t>
+              <w:t>1.0448</w:t>
             </w:r>
           </w:p>
         </w:tc>
@@ -8729,18 +8532,8 @@
             <w:vAlign w:val="center"/>
           </w:tcPr>
           <w:p>
-            <w:pPr>
-              <w:spacing w:before="0" w:after="0"/>
-              <w:jc w:val="center"/>
-            </w:pPr>
-            <w:r/>
             <w:r>
-              <w:rPr>
-                <w:rFonts w:ascii="Calibri" w:hAnsi="Calibri"/>
-                <w:color w:val="111111"/>
-                <w:sz w:val="18"/>
-              </w:rPr>
-              <w:t>1.5489</w:t>
+              <w:t>1.5915</w:t>
             </w:r>
           </w:p>
         </w:tc>
@@ -8756,18 +8549,8 @@
             <w:vAlign w:val="center"/>
           </w:tcPr>
           <w:p>
-            <w:pPr>
-              <w:spacing w:before="0" w:after="0"/>
-              <w:jc w:val="center"/>
-            </w:pPr>
-            <w:r/>
             <w:r>
-              <w:rPr>
-                <w:rFonts w:ascii="Calibri" w:hAnsi="Calibri"/>
-                <w:color w:val="111111"/>
-                <w:sz w:val="18"/>
-              </w:rPr>
-              <w:t>1.8467</w:t>
+              <w:t>3.0472</w:t>
             </w:r>
           </w:p>
         </w:tc>
@@ -9807,13 +9590,7 @@
         <w:pStyle w:val="Heading1"/>
       </w:pPr>
       <w:r>
-        <w:rPr>
-          <w:rFonts w:ascii="Calibri" w:hAnsi="Calibri"/>
-          <w:b/>
-          <w:color w:val="3C4A57"/>
-          <w:sz w:val="32"/>
-        </w:rPr>
-        <w:t>14. Real-agent acceptance plan</w:t>
+        <w:t>14. Real-agent acceptance</w:t>
       </w:r>
     </w:p>
     <w:p>
@@ -10027,12 +9804,7 @@
         <w:pStyle w:val="ListBullet"/>
       </w:pPr>
       <w:r>
-        <w:rPr>
-          <w:rFonts w:ascii="Calibri" w:hAnsi="Calibri"/>
-          <w:color w:val="111111"/>
-          <w:sz w:val="22"/>
-        </w:rPr>
-        <w:t>force the seven safe-lab schemas to load without built-in tool search;</w:t>
+        <w:t>retain Claude Code's non-executing ToolSearch capability so the host can discover the seven deferred safe-lab schemas;</w:t>
       </w:r>
     </w:p>
     <w:p>
@@ -10481,22 +10253,7 @@
         <w:pStyle w:val="ListBullet"/>
       </w:pPr>
       <w:r>
-        <w:rPr>
-          <w:rFonts w:ascii="Calibri" w:hAnsi="Calibri"/>
-          <w:color w:val="111111"/>
-          <w:sz w:val="22"/>
-        </w:rPr>
-        <w:t>14 JSONL records plus the enforcement database contained no raw arguments,</w:t>
-      </w:r>
-    </w:p>
-    <w:p>
-      <w:r>
-        <w:rPr>
-          <w:rFonts w:ascii="Calibri" w:hAnsi="Calibri"/>
-          <w:color w:val="111111"/>
-          <w:sz w:val="22"/>
-        </w:rPr>
-        <w:t>fixture contents, advisory values, or results.</w:t>
+        <w:t>14 JSONL records plus the enforcement database contained no raw arguments, fixture contents, advisory values, or results.</w:t>
       </w:r>
     </w:p>
     <w:p>
@@ -10541,13 +10298,69 @@
         <w:pStyle w:val="Heading2"/>
       </w:pPr>
       <w:r>
-        <w:rPr>
-          <w:rFonts w:ascii="Calibri" w:hAnsi="Calibri"/>
-          <w:b/>
-          <w:color w:val="3C4A57"/>
-          <w:sz w:val="26"/>
-        </w:rPr>
-        <w:t>14.4 Acceptance sequence</w:t>
+        <w:t>14.4 Post-SDK2 release-candidate repeat</w:t>
+      </w:r>
+    </w:p>
+    <w:p>
+      <w:pPr/>
+      <w:r>
+        <w:t>The complete controlled workflow was repeated after the SDK 2 migration at commit beaa6e9a4e382de27a385c26f433b56fd1e01f95. Claude Code 2.1.222 connected through local stdio to the project proxy; no model was downloaded and no production account, credential, or personal dataset was connected.</w:t>
+      </w:r>
+    </w:p>
+    <w:p>
+      <w:pPr>
+        <w:pStyle w:val="ListBullet"/>
+      </w:pPr>
+      <w:r>
+        <w:t>Two explicitly completed profiling runs produced six successful calls: two calls each to list_fixture_directory, read_fixture, and fetch_fixture_advisory.</w:t>
+      </w:r>
+    </w:p>
+    <w:p>
+      <w:pPr>
+        <w:pStyle w:val="ListBullet"/>
+      </w:pPr>
+      <w:r>
+        <w:t>The sealed evidence fingerprint is sha256:5b93f87eb9ea1c232bc51ecfca1f4f9aa03170835e76f8c63df017ae2fe46f98. The evidence contains two completed runs, zero aborted runs, six successful calls, zero incomplete calls, and no use of the four unnecessary capabilities.</w:t>
+      </w:r>
+    </w:p>
+    <w:p>
+      <w:pPr>
+        <w:pStyle w:val="ListBullet"/>
+      </w:pPr>
+      <w:r>
+        <w:t>The operator explicitly reviewed every candidate: the three necessary read-only tools were allowed with exact path, advisory, task, rate, and concurrency limits; the four unnecessary write, credential, command, and external-post tools were denied.</w:t>
+      </w:r>
+    </w:p>
+    <w:p>
+      <w:pPr>
+        <w:pStyle w:val="ListBullet"/>
+      </w:pPr>
+      <w:r>
+        <w:t>A direct deterministic preflight verified three visible tools, three allowed exact calls, four hidden-tool denials, three argument-boundary denials, one task-limit denial, and non-forwarding of the denied write.</w:t>
+      </w:r>
+    </w:p>
+    <w:p>
+      <w:pPr>
+        <w:pStyle w:val="ListBullet"/>
+      </w:pPr>
+      <w:r>
+        <w:t>The real Claude enforcement run then exposed only the three reviewed tools. Claude called each exactly once and completed the fixture dependency review. The enforcement state recorded exactly one task and rate reservation per tool and no approval permits.</w:t>
+      </w:r>
+    </w:p>
+    <w:p>
+      <w:pPr>
+        <w:pStyle w:val="ListBullet"/>
+      </w:pPr>
+      <w:r>
+        <w:t>All six enforcement event-v1 records passed schema validation. A privacy scan found no raw fixture path, advisory identifier, dependency value, model result, personal identifier, or workstation path.</w:t>
+      </w:r>
+    </w:p>
+    <w:p>
+      <w:pPr>
+        <w:pStyle w:val="Heading2"/>
+      </w:pPr>
+      <w:r>
+        <w:t>14.5 Acceptance sequence</w:t>
       </w:r>
     </w:p>
     <w:p>
@@ -10743,22 +10556,7 @@
         <w:pStyle w:val="ListNumber"/>
       </w:pPr>
       <w:r>
-        <w:rPr>
-          <w:rFonts w:ascii="Calibri" w:hAnsi="Calibri"/>
-          <w:color w:val="111111"/>
-          <w:sz w:val="22"/>
-        </w:rPr>
-        <w:t>Verify that only the three reviewed read-only tools are visible. **Completed</w:t>
-      </w:r>
-    </w:p>
-    <w:p>
-      <w:r>
-        <w:rPr>
-          <w:rFonts w:ascii="Calibri" w:hAnsi="Calibri"/>
-          <w:color w:val="111111"/>
-          <w:sz w:val="22"/>
-        </w:rPr>
-        <w:t>through direct MCP and Claude.**</w:t>
+        <w:t>Verify that only the three reviewed read-only tools are visible. Completed through direct MCP and Claude.</w:t>
       </w:r>
     </w:p>
     <w:p>
@@ -10766,23 +10564,7 @@
         <w:pStyle w:val="ListNumber"/>
       </w:pPr>
       <w:r>
-        <w:rPr>
-          <w:rFonts w:ascii="Calibri" w:hAnsi="Calibri"/>
-          <w:color w:val="111111"/>
-          <w:sz w:val="22"/>
-        </w:rPr>
-        <w:t>Complete the legitimate dependency-review task through those tools.</w:t>
-      </w:r>
-    </w:p>
-    <w:p>
-      <w:r>
-        <w:rPr>
-          <w:rFonts w:ascii="Calibri" w:hAnsi="Calibri"/>
-          <w:b/>
-          <w:color w:val="1F2933"/>
-          <w:sz w:val="22"/>
-        </w:rPr>
-        <w:t>Completed.</w:t>
+        <w:t>Complete the legitimate dependency-review task through those tools. Completed.</w:t>
       </w:r>
     </w:p>
     <w:p>
@@ -10790,23 +10572,7 @@
         <w:pStyle w:val="ListNumber"/>
       </w:pPr>
       <w:r>
-        <w:rPr>
-          <w:rFonts w:ascii="Calibri" w:hAnsi="Calibri"/>
-          <w:color w:val="111111"/>
-          <w:sz w:val="22"/>
-        </w:rPr>
-        <w:t>Use a separate deterministic probe to call every hidden tool directly.</w:t>
-      </w:r>
-    </w:p>
-    <w:p>
-      <w:r>
-        <w:rPr>
-          <w:rFonts w:ascii="Calibri" w:hAnsi="Calibri"/>
-          <w:b/>
-          <w:color w:val="1F2933"/>
-          <w:sz w:val="22"/>
-        </w:rPr>
-        <w:t>Completed.</w:t>
+        <w:t>Use a separate deterministic probe to call every hidden tool directly. Completed.</w:t>
       </w:r>
     </w:p>
     <w:p>
@@ -10814,23 +10580,7 @@
         <w:pStyle w:val="ListNumber"/>
       </w:pPr>
       <w:r>
-        <w:rPr>
-          <w:rFonts w:ascii="Calibri" w:hAnsi="Calibri"/>
-          <w:color w:val="111111"/>
-          <w:sz w:val="22"/>
-        </w:rPr>
-        <w:t>Verify denial, non-forwarding, limit behavior, and audit privacy.</w:t>
-      </w:r>
-    </w:p>
-    <w:p>
-      <w:r>
-        <w:rPr>
-          <w:rFonts w:ascii="Calibri" w:hAnsi="Calibri"/>
-          <w:b/>
-          <w:color w:val="1F2933"/>
-          <w:sz w:val="22"/>
-        </w:rPr>
-        <w:t>Completed.</w:t>
+        <w:t>Verify denial, non-forwarding, limit behavior, and audit privacy. Completed.</w:t>
       </w:r>
     </w:p>
     <w:p>
@@ -10838,23 +10588,7 @@
         <w:pStyle w:val="ListNumber"/>
       </w:pPr>
       <w:r>
-        <w:rPr>
-          <w:rFonts w:ascii="Calibri" w:hAnsi="Calibri"/>
-          <w:color w:val="111111"/>
-          <w:sz w:val="22"/>
-        </w:rPr>
-        <w:t>Run the complete local quality gates and update the release evidence.</w:t>
-      </w:r>
-    </w:p>
-    <w:p>
-      <w:r>
-        <w:rPr>
-          <w:rFonts w:ascii="Calibri" w:hAnsi="Calibri"/>
-          <w:b/>
-          <w:color w:val="1F2933"/>
-          <w:sz w:val="22"/>
-        </w:rPr>
-        <w:t>Completed.</w:t>
+        <w:t>Run the complete local quality gates and update the release evidence. The automated gates, hosted CI, distribution smoke tests, and clean 75-case benchmark are complete; a live Wazuh rerun remains.</w:t>
       </w:r>
     </w:p>
     <w:p>
@@ -10881,13 +10615,7 @@
         <w:pStyle w:val="Heading2"/>
       </w:pPr>
       <w:r>
-        <w:rPr>
-          <w:rFonts w:ascii="Calibri" w:hAnsi="Calibri"/>
-          <w:b/>
-          <w:color w:val="3C4A57"/>
-          <w:sz w:val="26"/>
-        </w:rPr>
-        <w:t>14.5 What constitutes success</w:t>
+        <w:t>14.6 What constitutes success</w:t>
       </w:r>
     </w:p>
     <w:p>
@@ -11013,13 +10741,7 @@
         <w:pStyle w:val="Heading2"/>
       </w:pPr>
       <w:r>
-        <w:rPr>
-          <w:rFonts w:ascii="Calibri" w:hAnsi="Calibri"/>
-          <w:b/>
-          <w:color w:val="3C4A57"/>
-          <w:sz w:val="26"/>
-        </w:rPr>
-        <w:t>15.1 Completed locally</w:t>
+        <w:t>15.1 Completed in private staging</w:t>
       </w:r>
     </w:p>
     <w:p>
@@ -11135,6 +10857,14 @@
         <w:pStyle w:val="ListBullet"/>
       </w:pPr>
       <w:r>
+        <w:t>a private GitHub staging repository with a successful hosted matrix across Ubuntu and Windows on Python 3.13 and 3.14, plus distribution build and smoke checks;</w:t>
+      </w:r>
+    </w:p>
+    <w:p>
+      <w:pPr>
+        <w:pStyle w:val="ListBullet"/>
+      </w:pPr>
+      <w:r>
         <w:rPr>
           <w:rFonts w:ascii="Calibri" w:hAnsi="Calibri"/>
           <w:color w:val="111111"/>
@@ -11359,29 +11089,7 @@
     </w:p>
     <w:p>
       <w:r>
-        <w:rPr>
-          <w:rFonts w:ascii="Calibri" w:hAnsi="Calibri"/>
-          <w:color w:val="111111"/>
-          <w:sz w:val="22"/>
-        </w:rPr>
-        <w:t xml:space="preserve">The real-Claude and live-Wazuh items in this list were completed before the SDK v2 migration. They remain useful historical evidence but must be regenerated from the exact release-candidate commit. The SDK v2 benchmark passed 75/75 cases from clean commit </w:t>
-      </w:r>
-      <w:r>
-        <w:rPr>
-          <w:rFonts w:ascii="Consolas" w:hAnsi="Consolas"/>
-          <w:color w:val="1F2933"/>
-          <w:sz w:val="21"/>
-          <w:shd w:fill="EDF1F4"/>
-        </w:rPr>
-        <w:t>51cfe43</w:t>
-      </w:r>
-      <w:r>
-        <w:rPr>
-          <w:rFonts w:ascii="Calibri" w:hAnsi="Calibri"/>
-          <w:color w:val="111111"/>
-          <w:sz w:val="22"/>
-        </w:rPr>
-        <w:t>; the post-migration build and clean-tree proofs also pass.</w:t>
+        <w:t>The controlled Claude profiling and enforcement workflow was repeated after the SDK v2 migration at commit beaa6e9a4e382de27a385c26f433b56fd1e01f95, and the hosted GitHub Actions matrix passed at that commit. The deterministic benchmark was refreshed after the executable lifecycle corrections and passed 75/75 cases from clean commit 3f7ba2ae2132bd34c645529a971648e2dfa2f2e6. The Wazuh engine and live-ingestion proof remains historical and must be rerun on the exact final candidate.</w:t>
       </w:r>
     </w:p>
     <w:p>
@@ -11408,7 +11116,7 @@
           <w:color w:val="111111"/>
           <w:sz w:val="22"/>
         </w:rPr>
-        <w:t>no GitHub remote;</w:t>
+        <w:t>no clean-clone test by another person;</w:t>
       </w:r>
     </w:p>
     <w:p>
@@ -11421,7 +11129,7 @@
           <w:color w:val="111111"/>
           <w:sz w:val="22"/>
         </w:rPr>
-        <w:t>no hosted CI run;</w:t>
+        <w:t>no external security or usability review;</w:t>
       </w:r>
     </w:p>
     <w:p>
@@ -11434,7 +11142,7 @@
           <w:color w:val="111111"/>
           <w:sz w:val="22"/>
         </w:rPr>
-        <w:t>no clean-clone test by another person;</w:t>
+        <w:t>no completed public release;</w:t>
       </w:r>
     </w:p>
     <w:p>
@@ -11447,7 +11155,7 @@
           <w:color w:val="111111"/>
           <w:sz w:val="22"/>
         </w:rPr>
-        <w:t>no external security or usability review;</w:t>
+        <w:t>no final trademark/domain/confusion clearance for package publication;</w:t>
       </w:r>
     </w:p>
     <w:p>
@@ -11455,38 +11163,7 @@
         <w:pStyle w:val="ListBullet"/>
       </w:pPr>
       <w:r>
-        <w:rPr>
-          <w:rFonts w:ascii="Calibri" w:hAnsi="Calibri"/>
-          <w:color w:val="111111"/>
-          <w:sz w:val="22"/>
-        </w:rPr>
-        <w:t>no completed public release;</w:t>
-      </w:r>
-    </w:p>
-    <w:p>
-      <w:pPr>
-        <w:pStyle w:val="ListBullet"/>
-      </w:pPr>
-      <w:r>
-        <w:rPr>
-          <w:rFonts w:ascii="Calibri" w:hAnsi="Calibri"/>
-          <w:color w:val="111111"/>
-          <w:sz w:val="22"/>
-        </w:rPr>
-        <w:t>no final trademark/domain/confusion clearance for package publication;</w:t>
-      </w:r>
-    </w:p>
-    <w:p>
-      <w:pPr>
-        <w:pStyle w:val="ListBullet"/>
-      </w:pPr>
-      <w:r>
-        <w:rPr>
-          <w:rFonts w:ascii="Calibri" w:hAnsi="Calibri"/>
-          <w:color w:val="111111"/>
-          <w:sz w:val="22"/>
-        </w:rPr>
-        <w:t>no post-SDK-v2 real-Claude or live-Wazuh acceptance run;</w:t>
+        <w:t>no live-Wazuh rerun on the exact current release candidate;</w:t>
       </w:r>
     </w:p>
     <w:p>
@@ -11521,12 +11198,7 @@
         <w:pStyle w:val="ListNumber"/>
       </w:pPr>
       <w:r>
-        <w:rPr>
-          <w:rFonts w:ascii="Calibri" w:hAnsi="Calibri"/>
-          <w:color w:val="111111"/>
-          <w:sz w:val="22"/>
-        </w:rPr>
-        <w:t>update evidence, beginner documentation, and this living report;</w:t>
+        <w:t>complete the documentation and living-report refresh;</w:t>
       </w:r>
     </w:p>
     <w:p>
@@ -11534,12 +11206,7 @@
         <w:pStyle w:val="ListNumber"/>
       </w:pPr>
       <w:r>
-        <w:rPr>
-          <w:rFonts w:ascii="Calibri" w:hAnsi="Calibri"/>
-          <w:color w:val="111111"/>
-          <w:sz w:val="22"/>
-        </w:rPr>
-        <w:t>run the complete local gates;</w:t>
+        <w:t>run the complete local gates and refresh the distribution, dependency, and Wazuh evidence;</w:t>
       </w:r>
     </w:p>
     <w:p>
@@ -11547,12 +11214,7 @@
         <w:pStyle w:val="ListNumber"/>
       </w:pPr>
       <w:r>
-        <w:rPr>
-          <w:rFonts w:ascii="Calibri" w:hAnsi="Calibri"/>
-          <w:color w:val="111111"/>
-          <w:sz w:val="22"/>
-        </w:rPr>
-        <w:t>push to a private GitHub repository;</w:t>
+        <w:t>rerun the Wazuh engine and live-ingestion proof on the exact candidate;</w:t>
       </w:r>
     </w:p>
     <w:p>
@@ -11560,12 +11222,7 @@
         <w:pStyle w:val="ListNumber"/>
       </w:pPr>
       <w:r>
-        <w:rPr>
-          <w:rFonts w:ascii="Calibri" w:hAnsi="Calibri"/>
-          <w:color w:val="111111"/>
-          <w:sz w:val="22"/>
-        </w:rPr>
-        <w:t>run hosted CI and a clean-clone test;</w:t>
+        <w:t>complete an independent clean-clone installation and usage test;</w:t>
       </w:r>
     </w:p>
     <w:p>
@@ -11573,11 +11230,6 @@
         <w:pStyle w:val="ListNumber"/>
       </w:pPr>
       <w:r>
-        <w:rPr>
-          <w:rFonts w:ascii="Calibri" w:hAnsi="Calibri"/>
-          <w:color w:val="111111"/>
-          <w:sz w:val="22"/>
-        </w:rPr>
         <w:t>perform external security and usability reviews;</w:t>
       </w:r>
     </w:p>
@@ -11586,11 +11238,6 @@
         <w:pStyle w:val="ListNumber"/>
       </w:pPr>
       <w:r>
-        <w:rPr>
-          <w:rFonts w:ascii="Calibri" w:hAnsi="Calibri"/>
-          <w:color w:val="111111"/>
-          <w:sz w:val="22"/>
-        </w:rPr>
         <w:t>complete final package-name confusion and trademark review;</w:t>
       </w:r>
     </w:p>
@@ -11599,12 +11246,7 @@
         <w:pStyle w:val="ListNumber"/>
       </w:pPr>
       <w:r>
-        <w:rPr>
-          <w:rFonts w:ascii="Calibri" w:hAnsi="Calibri"/>
-          <w:color w:val="111111"/>
-          <w:sz w:val="22"/>
-        </w:rPr>
-        <w:t>publish a pre-alpha release candidate with explicit limitations; and</w:t>
+        <w:t>change the verified private staging repository to public and publish a pre-alpha release candidate with explicit limitations; and</w:t>
       </w:r>
     </w:p>
     <w:p>
@@ -13927,18 +13569,8 @@
             <w:vAlign w:val="center"/>
           </w:tcPr>
           <w:p>
-            <w:pPr>
-              <w:spacing w:before="0" w:after="0"/>
-              <w:jc w:val="center"/>
-            </w:pPr>
-            <w:r/>
             <w:r>
-              <w:rPr>
-                <w:rFonts w:ascii="Calibri" w:hAnsi="Calibri"/>
-                <w:color w:val="111111"/>
-                <w:sz w:val="18"/>
-              </w:rPr>
-              <w:t>Local verified</w:t>
+              <w:t>Verified in private staging</w:t>
             </w:r>
           </w:p>
         </w:tc>
@@ -13954,17 +13586,8 @@
             <w:vAlign w:val="center"/>
           </w:tcPr>
           <w:p>
-            <w:pPr>
-              <w:spacing w:before="0" w:after="0"/>
-            </w:pPr>
-            <w:r/>
             <w:r>
-              <w:rPr>
-                <w:rFonts w:ascii="Calibri" w:hAnsi="Calibri"/>
-                <w:color w:val="111111"/>
-                <w:sz w:val="18"/>
-              </w:rPr>
-              <w:t>CI defined; hosted run remains</w:t>
+              <w:t>Hosted Ubuntu/Windows, Python 3.13/3.14, and distribution CI passed</w:t>
             </w:r>
           </w:p>
         </w:tc>
@@ -14332,17 +13955,8 @@
             <w:vAlign w:val="center"/>
           </w:tcPr>
           <w:p>
-            <w:pPr>
-              <w:spacing w:before="0" w:after="0"/>
-            </w:pPr>
-            <w:r/>
             <w:r>
-              <w:rPr>
-                <w:rFonts w:ascii="Calibri" w:hAnsi="Calibri"/>
-                <w:color w:val="111111"/>
-                <w:sz w:val="18"/>
-              </w:rPr>
-              <w:t>Implementation verified; SDK v2 agent rerun pending</w:t>
+              <w:t>Verified after SDK2 migration</w:t>
             </w:r>
           </w:p>
         </w:tc>
@@ -14358,17 +13972,8 @@
             <w:vAlign w:val="center"/>
           </w:tcPr>
           <w:p>
-            <w:pPr>
-              <w:spacing w:before="0" w:after="0"/>
-            </w:pPr>
-            <w:r/>
             <w:r>
-              <w:rPr>
-                <w:rFonts w:ascii="Calibri" w:hAnsi="Calibri"/>
-                <w:color w:val="111111"/>
-                <w:sz w:val="18"/>
-              </w:rPr>
-              <w:t>Earlier model-driven evidence and review remain historical</w:t>
+              <w:t>Two real Claude profile runs, sealed evidence, and explicit seven-tool review</w:t>
             </w:r>
           </w:p>
         </w:tc>
@@ -14412,17 +14017,8 @@
             <w:vAlign w:val="center"/>
           </w:tcPr>
           <w:p>
-            <w:pPr>
-              <w:spacing w:before="0" w:after="0"/>
-            </w:pPr>
-            <w:r/>
             <w:r>
-              <w:rPr>
-                <w:rFonts w:ascii="Calibri" w:hAnsi="Calibri"/>
-                <w:color w:val="111111"/>
-                <w:sz w:val="18"/>
-              </w:rPr>
-              <w:t>Automated SDK v2 path verified; agent rerun pending</w:t>
+              <w:t>Verified after SDK2 migration</w:t>
             </w:r>
           </w:p>
         </w:tc>
@@ -14438,17 +14034,8 @@
             <w:vAlign w:val="center"/>
           </w:tcPr>
           <w:p>
-            <w:pPr>
-              <w:spacing w:before="0" w:after="0"/>
-            </w:pPr>
-            <w:r/>
             <w:r>
-              <w:rPr>
-                <w:rFonts w:ascii="Calibri" w:hAnsi="Calibri"/>
-                <w:color w:val="111111"/>
-                <w:sz w:val="18"/>
-              </w:rPr>
-              <w:t>Exact catalog, denials, constraints, limits, and private audit pass in tests</w:t>
+              <w:t>Direct preflight and real Claude enforced run passed with exact three-tool catalog</w:t>
             </w:r>
           </w:p>
         </w:tc>
@@ -14653,17 +14240,8 @@
             <w:vAlign w:val="center"/>
           </w:tcPr>
           <w:p>
-            <w:pPr>
-              <w:spacing w:before="0" w:after="0"/>
-            </w:pPr>
-            <w:r/>
             <w:r>
-              <w:rPr>
-                <w:rFonts w:ascii="Calibri" w:hAnsi="Calibri"/>
-                <w:color w:val="111111"/>
-                <w:sz w:val="18"/>
-              </w:rPr>
-              <w:t>Clean SDK v2 run passed</w:t>
+              <w:t>Current clean SDK2 run passed</w:t>
             </w:r>
           </w:p>
         </w:tc>
@@ -14679,26 +14257,8 @@
             <w:vAlign w:val="center"/>
           </w:tcPr>
           <w:p>
-            <w:pPr>
-              <w:spacing w:before="0" w:after="0"/>
-            </w:pPr>
-            <w:r/>
             <w:r>
-              <w:rPr>
-                <w:rFonts w:ascii="Calibri" w:hAnsi="Calibri"/>
-                <w:color w:val="111111"/>
-                <w:sz w:val="18"/>
-              </w:rPr>
-              <w:t xml:space="preserve">75/75 cases at commit </w:t>
-            </w:r>
-            <w:r>
-              <w:rPr>
-                <w:rFonts w:ascii="Consolas" w:hAnsi="Consolas"/>
-                <w:color w:val="1F2933"/>
-                <w:sz w:val="18"/>
-                <w:shd w:fill="EDF1F4"/>
-              </w:rPr>
-              <w:t>51cfe43</w:t>
+              <w:t>75/75 cases at commit 3f7ba2a after lifecycle corrections</w:t>
             </w:r>
           </w:p>
         </w:tc>
@@ -14742,18 +14302,8 @@
             <w:vAlign w:val="center"/>
           </w:tcPr>
           <w:p>
-            <w:pPr>
-              <w:spacing w:before="0" w:after="0"/>
-              <w:jc w:val="center"/>
-            </w:pPr>
-            <w:r/>
             <w:r>
-              <w:rPr>
-                <w:rFonts w:ascii="Calibri" w:hAnsi="Calibri"/>
-                <w:color w:val="111111"/>
-                <w:sz w:val="18"/>
-              </w:rPr>
-              <w:t>In progress</w:t>
+              <w:t>Private staging verified; public release pending</w:t>
             </w:r>
           </w:p>
         </w:tc>
@@ -14769,17 +14319,8 @@
             <w:vAlign w:val="center"/>
           </w:tcPr>
           <w:p>
-            <w:pPr>
-              <w:spacing w:before="0" w:after="0"/>
-            </w:pPr>
-            <w:r/>
             <w:r>
-              <w:rPr>
-                <w:rFonts w:ascii="Calibri" w:hAnsi="Calibri"/>
-                <w:color w:val="111111"/>
-                <w:sz w:val="18"/>
-              </w:rPr>
-              <w:t>Local build and clean-tree proof pass; hosted CI, independent clone, reviews, and release remain</w:t>
+              <w:t>Hosted CI and current benchmark pass; Wazuh, independent review, name clearance, and publication remain</w:t>
             </w:r>
           </w:p>
         </w:tc>
@@ -14814,13 +14355,7 @@
         <w:shd w:fill="F4F5F6"/>
       </w:pPr>
       <w:r>
-        <w:rPr>
-          <w:rFonts w:ascii="Calibri" w:hAnsi="Calibri"/>
-          <w:i/>
-          <w:color w:val="1F2933"/>
-          <w:sz w:val="22"/>
-        </w:rPr>
-        <w:t>MCP Privilege Profiler is a pre-alpha, task-scoped security proxy for one local stdio MCP server. It converts labeled run evidence into a human-reviewed, deny-by-default policy; hides denied tools; enforces exact constraints, limits, approvals, audit, and drift checks; and emits privacy-minimized events with a tested Wazuh detection bridge. The SDK v2 deterministic lab and automated suite pass; earlier Wazuh and controlled real-agent evidence must be repeated for the release candidate. A source-checkout safe demo exercises the enforced boundary, while hosted CI, independent clean-clone review, external review, and public release remain.</w:t>
+        <w:t>MCP Privilege Profiler is a pre-alpha, task-scoped security proxy for one local stdio MCP server. It converts labeled run evidence into a human-reviewed, deny-by-default policy; hides denied tools; enforces exact constraints, limits, approvals, audit, and drift checks; and emits privacy-minimized events with a tested Wazuh detection bridge. The SDK v2 automated suite, private hosted CI matrix, controlled Claude profiling, human review, deterministic enforcement preflight, real Claude enforced task, distribution smoke tests, and current clean 75-case benchmark pass. The Wazuh proof still requires a final-candidate refresh, and independent review, name clearance, and public release remain.</w:t>
       </w:r>
     </w:p>
     <w:sectPr>

</xml_diff>

<commit_message>
Publish public pre-alpha project
</commit_message>
<xml_diff>
--- a/docs/reports/MCP_Privilege_Profiler_Project_Report.docx
+++ b/docs/reports/MCP_Privilege_Profiler_Project_Report.docx
@@ -464,7 +464,7 @@
           </w:tcPr>
           <w:p>
             <w:r>
-              <w:t>Wazuh rerun, independent review, name clearance, and public release</w:t>
+              <w:t>Wazuh rerun, independent review, name clearance, and a versioned release</w:t>
             </w:r>
           </w:p>
         </w:tc>
@@ -589,21 +589,7 @@
         <w:pStyle w:val="ListBullet"/>
       </w:pPr>
       <w:r>
-        <w:rPr>
-          <w:rFonts w:ascii="Calibri" w:hAnsi="Calibri"/>
-          <w:b/>
-          <w:color w:val="111111"/>
-          <w:sz w:val="22"/>
-        </w:rPr>
-        <w:t>Project status:</w:t>
-      </w:r>
-      <w:r>
-        <w:rPr>
-          <w:rFonts w:ascii="Calibri" w:hAnsi="Calibri"/>
-          <w:color w:val="111111"/>
-          <w:sz w:val="22"/>
-        </w:rPr>
-        <w:t xml:space="preserve"> Pre-alpha; Stage 11 open-source preparation in progress</w:t>
+        <w:t>Project status: Public pre-alpha source project; versioned release preparation in progress</w:t>
       </w:r>
     </w:p>
     <w:p>
@@ -909,7 +895,7 @@
     </w:p>
     <w:p>
       <w:r>
-        <w:t>Since the MCP Python SDK 2.0.0 migration, the complete automated suite, distribution checks, controlled Claude profiling and policy-enforced Claude run, hosted GitHub Actions matrix, and current clean 75-case benchmark have passed. The earlier Wazuh engine and live-ingestion proof remains valid historical evidence, but it has not yet been rerun on the exact current release-candidate commit. Independent review, final package-name clearance, and public release also remain.</w:t>
+        <w:t>Since the MCP Python SDK 2.0.0 migration, the complete automated suite, distribution checks, controlled Claude profiling and policy-enforced Claude run, hosted GitHub Actions matrix, and current clean 75-case benchmark have passed. The source repository is now public as a pre-alpha project. The earlier Wazuh engine and live-ingestion proof remains valid historical evidence, but it has not yet been rerun on the exact current release-candidate commit. Independent review, final package-name clearance, release artifacts, and a versioned release remain.</w:t>
       </w:r>
     </w:p>
     <w:p>
@@ -10741,7 +10727,7 @@
         <w:pStyle w:val="Heading2"/>
       </w:pPr>
       <w:r>
-        <w:t>15.1 Completed in private staging</w:t>
+        <w:t>15.1 Completed for public source publication</w:t>
       </w:r>
     </w:p>
     <w:p>
@@ -10857,7 +10843,7 @@
         <w:pStyle w:val="ListBullet"/>
       </w:pPr>
       <w:r>
-        <w:t>a private GitHub staging repository with a successful hosted matrix across Ubuntu and Windows on Python 3.13 and 3.14, plus distribution build and smoke checks;</w:t>
+        <w:t>a public GitHub source repository with a successful hosted matrix at publication commit e4f54a82627d8e8b85fdc840e9e1741e12775042 across Ubuntu and Windows on Python 3.13 and 3.14, plus distribution build and smoke checks;</w:t>
       </w:r>
     </w:p>
     <w:p>
@@ -11089,7 +11075,7 @@
     </w:p>
     <w:p>
       <w:r>
-        <w:t>The controlled Claude profiling and enforcement workflow was repeated after the SDK v2 migration at commit beaa6e9a4e382de27a385c26f433b56fd1e01f95, and the hosted GitHub Actions matrix passed at that commit. The deterministic benchmark was refreshed after the executable lifecycle corrections and passed 75/75 cases from clean commit 3f7ba2ae2132bd34c645529a971648e2dfa2f2e6. The Wazuh engine and live-ingestion proof remains historical and must be rerun on the exact final candidate.</w:t>
+        <w:t>The controlled Claude profiling and enforcement workflow was repeated after the SDK v2 migration at commit beaa6e9a4e382de27a385c26f433b56fd1e01f95. The hosted GitHub Actions matrix passed again at public-source publication commit e4f54a82627d8e8b85fdc840e9e1741e12775042. The deterministic benchmark was refreshed after the executable lifecycle corrections and passed 75/75 cases from clean commit 3f7ba2ae2132bd34c645529a971648e2dfa2f2e6. The Wazuh engine and live-ingestion proof remains historical and must be rerun on the exact final candidate.</w:t>
       </w:r>
     </w:p>
     <w:p>
@@ -11137,12 +11123,7 @@
         <w:pStyle w:val="ListBullet"/>
       </w:pPr>
       <w:r>
-        <w:rPr>
-          <w:rFonts w:ascii="Calibri" w:hAnsi="Calibri"/>
-          <w:color w:val="111111"/>
-          <w:sz w:val="22"/>
-        </w:rPr>
-        <w:t>no completed public release;</w:t>
+        <w:t>no tagged/versioned GitHub release or PyPI package;</w:t>
       </w:r>
     </w:p>
     <w:p>
@@ -11184,13 +11165,7 @@
         <w:pStyle w:val="Heading2"/>
       </w:pPr>
       <w:r>
-        <w:rPr>
-          <w:rFonts w:ascii="Calibri" w:hAnsi="Calibri"/>
-          <w:b/>
-          <w:color w:val="3C4A57"/>
-          <w:sz w:val="26"/>
-        </w:rPr>
-        <w:t>15.3 Publication sequence</w:t>
+        <w:t>15.3 Sequence from public source to a versioned release</w:t>
       </w:r>
     </w:p>
     <w:p>
@@ -11198,7 +11173,7 @@
         <w:pStyle w:val="ListNumber"/>
       </w:pPr>
       <w:r>
-        <w:t>complete the documentation and living-report refresh;</w:t>
+        <w:t>complete an independent clean-clone installation and usage test;</w:t>
       </w:r>
     </w:p>
     <w:p>
@@ -11206,7 +11181,7 @@
         <w:pStyle w:val="ListNumber"/>
       </w:pPr>
       <w:r>
-        <w:t>run the complete local gates and refresh the distribution, dependency, and Wazuh evidence;</w:t>
+        <w:t>refresh the live Wazuh proof on the exact release candidate;</w:t>
       </w:r>
     </w:p>
     <w:p>
@@ -11214,7 +11189,7 @@
         <w:pStyle w:val="ListNumber"/>
       </w:pPr>
       <w:r>
-        <w:t>rerun the Wazuh engine and live-ingestion proof on the exact candidate;</w:t>
+        <w:t>perform external MCP, security, and usability reviews;</w:t>
       </w:r>
     </w:p>
     <w:p>
@@ -11222,7 +11197,7 @@
         <w:pStyle w:val="ListNumber"/>
       </w:pPr>
       <w:r>
-        <w:t>complete an independent clean-clone installation and usage test;</w:t>
+        <w:t>complete final package-name confusion and trademark review;</w:t>
       </w:r>
     </w:p>
     <w:p>
@@ -11230,7 +11205,7 @@
         <w:pStyle w:val="ListNumber"/>
       </w:pPr>
       <w:r>
-        <w:t>perform external security and usability reviews;</w:t>
+        <w:t>enable and test the remaining supported GitHub security controls;</w:t>
       </w:r>
     </w:p>
     <w:p>
@@ -11238,7 +11213,7 @@
         <w:pStyle w:val="ListNumber"/>
       </w:pPr>
       <w:r>
-        <w:t>complete final package-name confusion and trademark review;</w:t>
+        <w:t>produce the SBOM, SHA-256 checksums, and release notes;</w:t>
       </w:r>
     </w:p>
     <w:p>
@@ -11246,7 +11221,7 @@
         <w:pStyle w:val="ListNumber"/>
       </w:pPr>
       <w:r>
-        <w:t>change the verified private staging repository to public and publish a pre-alpha release candidate with explicit limitations; and</w:t>
+        <w:t>publish a pre-alpha release candidate with explicit limitations; and</w:t>
       </w:r>
     </w:p>
     <w:p>
@@ -13570,7 +13545,7 @@
           </w:tcPr>
           <w:p>
             <w:r>
-              <w:t>Verified in private staging</w:t>
+              <w:t>Verified in public source repository</w:t>
             </w:r>
           </w:p>
         </w:tc>
@@ -13587,7 +13562,7 @@
           </w:tcPr>
           <w:p>
             <w:r>
-              <w:t>Hosted Ubuntu/Windows, Python 3.13/3.14, and distribution CI passed</w:t>
+              <w:t>Hosted Ubuntu/Windows, Python 3.13/3.14, and distribution CI passed at e4f54a8</w:t>
             </w:r>
           </w:p>
         </w:tc>
@@ -14303,7 +14278,7 @@
           </w:tcPr>
           <w:p>
             <w:r>
-              <w:t>Private staging verified; public release pending</w:t>
+              <w:t>Public pre-alpha source published</w:t>
             </w:r>
           </w:p>
         </w:tc>
@@ -14320,7 +14295,7 @@
           </w:tcPr>
           <w:p>
             <w:r>
-              <w:t>Hosted CI and current benchmark pass; Wazuh, independent review, name clearance, and publication remain</w:t>
+              <w:t>Hosted CI and current benchmark pass; Wazuh, independent review, name clearance, artifacts, and a versioned release remain</w:t>
             </w:r>
           </w:p>
         </w:tc>
@@ -14355,7 +14330,7 @@
         <w:shd w:fill="F4F5F6"/>
       </w:pPr>
       <w:r>
-        <w:t>MCP Privilege Profiler is a pre-alpha, task-scoped security proxy for one local stdio MCP server. It converts labeled run evidence into a human-reviewed, deny-by-default policy; hides denied tools; enforces exact constraints, limits, approvals, audit, and drift checks; and emits privacy-minimized events with a tested Wazuh detection bridge. The SDK v2 automated suite, private hosted CI matrix, controlled Claude profiling, human review, deterministic enforcement preflight, real Claude enforced task, distribution smoke tests, and current clean 75-case benchmark pass. The Wazuh proof still requires a final-candidate refresh, and independent review, name clearance, and public release remain.</w:t>
+        <w:t>MCP Privilege Profiler is a public pre-alpha, task-scoped security proxy for one local stdio MCP server. It converts labeled run evidence into a human-reviewed, deny-by-default policy; hides denied tools; enforces exact constraints, limits, approvals, audit, and drift checks; and emits privacy-minimized events with a tested Wazuh detection bridge. The SDK v2 automated suite, public hosted CI matrix, controlled Claude profiling, human review, deterministic enforcement preflight, real Claude enforced task, distribution smoke tests, and current clean 75-case benchmark pass. The Wazuh proof still requires a final-candidate refresh, and independent review, name clearance, release artifacts, and a versioned release remain.</w:t>
       </w:r>
     </w:p>
     <w:sectPr>

</xml_diff>